<commit_message>
Update student details to Vedant Udadange (PRN: 2125UCSM1085) and repository link
</commit_message>
<xml_diff>
--- a/Unit_1_LAN_Mini_Project_Report.docx
+++ b/Unit_1_LAN_Mini_Project_Report.docx
@@ -50,7 +50,7 @@
           <w:sz w:val="32"/>
           <w:szCs w:val="32"/>
         </w:rPr>
-        <w:t>PRN:2125UCSM1042</w:t>
+        <w:t>PRN:2125UCSM1085</w:t>
       </w:r>
       <w:r>
         <w:rPr>
@@ -160,7 +160,7 @@
                 <w:sz w:val="32"/>
                 <w:szCs w:val="32"/>
               </w:rPr>
-              <w:t>Shubham</w:t>
+              <w:t>Vedant Udadange</w:t>
             </w:r>
           </w:p>
         </w:tc>
@@ -421,7 +421,7 @@
                 <w:b w:val="0"/>
                 <w:sz w:val="20"/>
               </w:rPr>
-              <w:t>Cisco-Packet-Tracer-LAN-Mini-Project</w:t>
+              <w:t>U1-npc</w:t>
             </w:r>
           </w:p>
         </w:tc>
@@ -467,7 +467,7 @@
                   <w:u w:val="single"/>
                   <w:sz w:val="19"/>
                 </w:rPr>
-                <w:t>https://github.com/ShubhamShinde148/Cisco-Packet-Tracer-LAN-Mini-Project</w:t>
+                <w:t>https://github.com/vedantudadange25ucs-ctrl/U1-npc</w:t>
               </w:r>
             </w:hyperlink>
           </w:p>
@@ -2924,7 +2924,7 @@
             <w:u w:val="single"/>
             <w:sz w:val="28"/>
           </w:rPr>
-          <w:t>https://github.com/ShubhamShinde148/Cisco-Packet-Tracer-LAN-Mini-Project</w:t>
+          <w:t>https://github.com/vedantudadange25ucs-ctrl/U1-npc</w:t>
         </w:r>
       </w:hyperlink>
     </w:p>

</xml_diff>